<commit_message>
lab: adds new ready lab2
</commit_message>
<xml_diff>
--- a/lab_2/task/РекСис_ЛР2_23_ИИ_описание.docx
+++ b/lab_2/task/РекСис_ЛР2_23_ИИ_описание.docx
@@ -1,6 +1,6 @@
 
 <file path=word/document.xml><?xml version="1.0" encoding="utf-8"?>
-<w:document xmlns:wpc="http://schemas.microsoft.com/office/word/2010/wordprocessingCanvas" xmlns:cx="http://schemas.microsoft.com/office/drawing/2014/chartex" xmlns:mc="http://schemas.openxmlformats.org/markup-compatibility/2006" xmlns:o="urn:schemas-microsoft-com:office:office" xmlns:r="http://schemas.openxmlformats.org/officeDocument/2006/relationships" xmlns:m="http://schemas.openxmlformats.org/officeDocument/2006/math" xmlns:v="urn:schemas-microsoft-com:vml" xmlns:wp14="http://schemas.microsoft.com/office/word/2010/wordprocessingDrawing" xmlns:wp="http://schemas.openxmlformats.org/drawingml/2006/wordprocessingDrawing" xmlns:w10="urn:schemas-microsoft-com:office:word" xmlns:w="http://schemas.openxmlformats.org/wordprocessingml/2006/main" xmlns:w14="http://schemas.microsoft.com/office/word/2010/wordml" xmlns:w15="http://schemas.microsoft.com/office/word/2012/wordml" xmlns:w16se="http://schemas.microsoft.com/office/word/2015/wordml/symex" xmlns:wpg="http://schemas.microsoft.com/office/word/2010/wordprocessingGroup" xmlns:wpi="http://schemas.microsoft.com/office/word/2010/wordprocessingInk" xmlns:wne="http://schemas.microsoft.com/office/word/2006/wordml" xmlns:wps="http://schemas.microsoft.com/office/word/2010/wordprocessingShape" mc:Ignorable="w14 w15 w16se wp14">
+<w:document xmlns:wpc="http://schemas.microsoft.com/office/word/2010/wordprocessingCanvas" xmlns:cx="http://schemas.microsoft.com/office/drawing/2014/chartex" xmlns:cx1="http://schemas.microsoft.com/office/drawing/2015/9/8/chartex" xmlns:cx2="http://schemas.microsoft.com/office/drawing/2015/10/21/chartex" xmlns:cx3="http://schemas.microsoft.com/office/drawing/2016/5/9/chartex" xmlns:cx4="http://schemas.microsoft.com/office/drawing/2016/5/10/chartex" xmlns:cx5="http://schemas.microsoft.com/office/drawing/2016/5/11/chartex" xmlns:cx6="http://schemas.microsoft.com/office/drawing/2016/5/12/chartex" xmlns:cx7="http://schemas.microsoft.com/office/drawing/2016/5/13/chartex" xmlns:cx8="http://schemas.microsoft.com/office/drawing/2016/5/14/chartex" xmlns:mc="http://schemas.openxmlformats.org/markup-compatibility/2006" xmlns:aink="http://schemas.microsoft.com/office/drawing/2016/ink" xmlns:am3d="http://schemas.microsoft.com/office/drawing/2017/model3d" xmlns:o="urn:schemas-microsoft-com:office:office" xmlns:oel="http://schemas.microsoft.com/office/2019/extlst" xmlns:r="http://schemas.openxmlformats.org/officeDocument/2006/relationships" xmlns:m="http://schemas.openxmlformats.org/officeDocument/2006/math" xmlns:v="urn:schemas-microsoft-com:vml" xmlns:wp14="http://schemas.microsoft.com/office/word/2010/wordprocessingDrawing" xmlns:wp="http://schemas.openxmlformats.org/drawingml/2006/wordprocessingDrawing" xmlns:w10="urn:schemas-microsoft-com:office:word" xmlns:w="http://schemas.openxmlformats.org/wordprocessingml/2006/main" xmlns:w14="http://schemas.microsoft.com/office/word/2010/wordml" xmlns:w15="http://schemas.microsoft.com/office/word/2012/wordml" xmlns:w16cex="http://schemas.microsoft.com/office/word/2018/wordml/cex" xmlns:w16cid="http://schemas.microsoft.com/office/word/2016/wordml/cid" xmlns:w16="http://schemas.microsoft.com/office/word/2018/wordml" xmlns:w16du="http://schemas.microsoft.com/office/word/2023/wordml/word16du" xmlns:w16sdtdh="http://schemas.microsoft.com/office/word/2020/wordml/sdtdatahash" xmlns:w16sdtfl="http://schemas.microsoft.com/office/word/2024/wordml/sdtformatlock" xmlns:w16se="http://schemas.microsoft.com/office/word/2015/wordml/symex" xmlns:wpg="http://schemas.microsoft.com/office/word/2010/wordprocessingGroup" xmlns:wpi="http://schemas.microsoft.com/office/word/2010/wordprocessingInk" xmlns:wne="http://schemas.microsoft.com/office/word/2006/wordml" xmlns:wps="http://schemas.microsoft.com/office/word/2010/wordprocessingShape" mc:Ignorable="w14 w15 w16se w16cid w16 w16cex w16sdtdh w16sdtfl w16du wp14">
   <w:body>
     <w:p>
       <w:pPr>
@@ -47,40 +47,32 @@
         <w:jc w:val="both"/>
       </w:pPr>
       <w:r>
-        <w:t xml:space="preserve">Получить практические навыки разработки персонализированных рекомендательных систем на основе контентной и </w:t>
+        <w:t>Получить практические навыки разработки персонализированных рекомендательных систем на основе контентной и коллаборативной фильтрации, освоить методы вычисления сходства пользователей и объектов, поиска ближайших соседей и прогнозирования пользовательских оценок, а также провести сравнительный анализ различных рекомендательных алгоритмов.</w:t>
+      </w:r>
+    </w:p>
+    <w:p>
+      <w:pPr>
+        <w:pStyle w:val="3"/>
+        <w:spacing w:before="0" w:beforeAutospacing="0" w:after="0" w:afterAutospacing="0" w:line="360" w:lineRule="auto"/>
+      </w:pPr>
+      <w:r>
+        <w:t>2. Исходные данные</w:t>
+      </w:r>
+    </w:p>
+    <w:p>
+      <w:pPr>
+        <w:pStyle w:val="a3"/>
+        <w:spacing w:before="0" w:beforeAutospacing="0" w:after="0" w:afterAutospacing="0" w:line="360" w:lineRule="auto"/>
+      </w:pPr>
+      <w:r>
+        <w:t xml:space="preserve">Для выполнения работы используется набор данных </w:t>
       </w:r>
       <w:proofErr w:type="spellStart"/>
       <w:r>
-        <w:t>коллаборативной</w:t>
+        <w:t>MovieLens</w:t>
       </w:r>
       <w:proofErr w:type="spellEnd"/>
       <w:r>
-        <w:t xml:space="preserve"> фильтрации, освоить методы вычисления сходства пользователей и объектов, поиска ближайших соседей и прогнозирования пользовательских оценок, а также провести сравнительный анализ различных рекомендательных алгоритмов.</w:t>
-      </w:r>
-    </w:p>
-    <w:p>
-      <w:pPr>
-        <w:pStyle w:val="3"/>
-        <w:spacing w:before="0" w:beforeAutospacing="0" w:after="0" w:afterAutospacing="0" w:line="360" w:lineRule="auto"/>
-      </w:pPr>
-      <w:r>
-        <w:t>2. Исходные данные</w:t>
-      </w:r>
-    </w:p>
-    <w:p>
-      <w:pPr>
-        <w:pStyle w:val="a3"/>
-        <w:spacing w:before="0" w:beforeAutospacing="0" w:after="0" w:afterAutospacing="0" w:line="360" w:lineRule="auto"/>
-      </w:pPr>
-      <w:r>
-        <w:t xml:space="preserve">Для выполнения работы используется набор данных </w:t>
-      </w:r>
-      <w:proofErr w:type="spellStart"/>
-      <w:r>
-        <w:t>MovieLens</w:t>
-      </w:r>
-      <w:proofErr w:type="spellEnd"/>
-      <w:r>
         <w:t xml:space="preserve"> 100K, разделённый на 15 индивидуальных частей.</w:t>
       </w:r>
     </w:p>
@@ -110,11 +102,9 @@
       <w:r>
         <w:t xml:space="preserve">Структура </w:t>
       </w:r>
-      <w:proofErr w:type="spellStart"/>
       <w:r>
         <w:t>датасета</w:t>
       </w:r>
-      <w:proofErr w:type="spellEnd"/>
       <w:r>
         <w:t>:</w:t>
       </w:r>
@@ -310,15 +300,7 @@
               <w:spacing w:before="0" w:beforeAutospacing="0" w:after="0" w:afterAutospacing="0" w:line="360" w:lineRule="auto"/>
             </w:pPr>
             <w:r>
-              <w:t xml:space="preserve">Время выставления оценки в формате </w:t>
-            </w:r>
-            <w:proofErr w:type="spellStart"/>
-            <w:r>
-              <w:t>Unix</w:t>
-            </w:r>
-            <w:proofErr w:type="spellEnd"/>
-            <w:r>
-              <w:t xml:space="preserve"> </w:t>
+              <w:t xml:space="preserve">Время выставления оценки в формате Unix </w:t>
             </w:r>
             <w:proofErr w:type="spellStart"/>
             <w:r>
@@ -398,25 +380,7 @@
           <w:sz w:val="24"/>
           <w:szCs w:val="24"/>
         </w:rPr>
-        <w:t xml:space="preserve">Загрузить индивидуальный </w:t>
-      </w:r>
-      <w:proofErr w:type="spellStart"/>
-      <w:r>
-        <w:rPr>
-          <w:rFonts w:ascii="Times New Roman" w:hAnsi="Times New Roman" w:cs="Times New Roman"/>
-          <w:sz w:val="24"/>
-          <w:szCs w:val="24"/>
-        </w:rPr>
-        <w:t>датасет</w:t>
-      </w:r>
-      <w:proofErr w:type="spellEnd"/>
-      <w:r>
-        <w:rPr>
-          <w:rFonts w:ascii="Times New Roman" w:hAnsi="Times New Roman" w:cs="Times New Roman"/>
-          <w:sz w:val="24"/>
-          <w:szCs w:val="24"/>
-        </w:rPr>
-        <w:t xml:space="preserve"> с оценками пользователей и файл movies.csv.</w:t>
+        <w:t>Загрузить индивидуальный датасет с оценками пользователей и файл movies.csv.</w:t>
       </w:r>
     </w:p>
     <w:p>
@@ -563,25 +527,7 @@
           <w:sz w:val="24"/>
           <w:szCs w:val="24"/>
         </w:rPr>
-        <w:t xml:space="preserve">6. Построить матрицу </w:t>
-      </w:r>
-      <w:proofErr w:type="spellStart"/>
-      <w:r>
-        <w:rPr>
-          <w:rFonts w:ascii="Times New Roman" w:hAnsi="Times New Roman" w:cs="Times New Roman"/>
-          <w:sz w:val="24"/>
-          <w:szCs w:val="24"/>
-        </w:rPr>
-        <w:t>User</w:t>
-      </w:r>
-      <w:proofErr w:type="spellEnd"/>
-      <w:r>
-        <w:rPr>
-          <w:rFonts w:ascii="Times New Roman" w:hAnsi="Times New Roman" w:cs="Times New Roman"/>
-          <w:sz w:val="24"/>
-          <w:szCs w:val="24"/>
-        </w:rPr>
-        <w:t>–</w:t>
+        <w:t>6. Построить матрицу User–</w:t>
       </w:r>
       <w:proofErr w:type="spellStart"/>
       <w:r>
@@ -673,89 +619,84 @@
       <w:r>
         <w:t xml:space="preserve">Задание 2. </w:t>
       </w:r>
+      <w:r>
+        <w:t xml:space="preserve">Content-Based </w:t>
+      </w:r>
       <w:proofErr w:type="spellStart"/>
       <w:r>
-        <w:t>Content-Based</w:t>
+        <w:t>Filtering</w:t>
       </w:r>
       <w:proofErr w:type="spellEnd"/>
       <w:r>
-        <w:t xml:space="preserve"> </w:t>
+        <w:t>: вычисление сходства фильмов</w:t>
+      </w:r>
+    </w:p>
+    <w:p>
+      <w:pPr>
+        <w:spacing w:after="0" w:line="360" w:lineRule="auto"/>
+        <w:rPr>
+          <w:rFonts w:ascii="Times New Roman" w:hAnsi="Times New Roman" w:cs="Times New Roman"/>
+          <w:sz w:val="24"/>
+          <w:szCs w:val="24"/>
+        </w:rPr>
+      </w:pPr>
+      <w:r>
+        <w:rPr>
+          <w:rFonts w:ascii="Times New Roman" w:hAnsi="Times New Roman" w:cs="Times New Roman"/>
+          <w:sz w:val="24"/>
+          <w:szCs w:val="24"/>
+        </w:rPr>
+        <w:t>Реализовать контентную фильтрацию на основе жанровых характеристик фильмов.</w:t>
+      </w:r>
+    </w:p>
+    <w:p>
+      <w:pPr>
+        <w:spacing w:after="0" w:line="360" w:lineRule="auto"/>
+        <w:rPr>
+          <w:rFonts w:ascii="Times New Roman" w:hAnsi="Times New Roman" w:cs="Times New Roman"/>
+          <w:b/>
+          <w:sz w:val="24"/>
+          <w:szCs w:val="24"/>
+        </w:rPr>
+      </w:pPr>
+      <w:r>
+        <w:rPr>
+          <w:rFonts w:ascii="Times New Roman" w:hAnsi="Times New Roman" w:cs="Times New Roman"/>
+          <w:b/>
+          <w:sz w:val="24"/>
+          <w:szCs w:val="24"/>
+        </w:rPr>
+        <w:t>Этап 1. Формирование векторов признаков</w:t>
+      </w:r>
+    </w:p>
+    <w:p>
+      <w:pPr>
+        <w:spacing w:after="0" w:line="360" w:lineRule="auto"/>
+        <w:rPr>
+          <w:rFonts w:ascii="Times New Roman" w:hAnsi="Times New Roman" w:cs="Times New Roman"/>
+          <w:sz w:val="24"/>
+          <w:szCs w:val="24"/>
+        </w:rPr>
+      </w:pPr>
+      <w:r>
+        <w:rPr>
+          <w:rFonts w:ascii="Times New Roman" w:hAnsi="Times New Roman" w:cs="Times New Roman"/>
+          <w:sz w:val="24"/>
+          <w:szCs w:val="24"/>
+        </w:rPr>
+        <w:t xml:space="preserve">Для каждого фильма сформировать бинарный вектор жанров: </w:t>
       </w:r>
       <w:proofErr w:type="spellStart"/>
       <w:r>
-        <w:t>Filtering</w:t>
+        <w:rPr>
+          <w:rFonts w:ascii="Times New Roman" w:hAnsi="Times New Roman" w:cs="Times New Roman"/>
+          <w:sz w:val="24"/>
+          <w:szCs w:val="24"/>
+        </w:rPr>
+        <w:t>xi</w:t>
       </w:r>
       <w:proofErr w:type="spellEnd"/>
       <w:r>
-        <w:t>: вычисление сходства фильмов</w:t>
-      </w:r>
-    </w:p>
-    <w:p>
-      <w:pPr>
-        <w:spacing w:after="0" w:line="360" w:lineRule="auto"/>
-        <w:rPr>
-          <w:rFonts w:ascii="Times New Roman" w:hAnsi="Times New Roman" w:cs="Times New Roman"/>
-          <w:sz w:val="24"/>
-          <w:szCs w:val="24"/>
-        </w:rPr>
-      </w:pPr>
-      <w:r>
-        <w:rPr>
-          <w:rFonts w:ascii="Times New Roman" w:hAnsi="Times New Roman" w:cs="Times New Roman"/>
-          <w:sz w:val="24"/>
-          <w:szCs w:val="24"/>
-        </w:rPr>
-        <w:t>Реализовать контентную фильтрацию на основе жанровых характеристик фильмов.</w:t>
-      </w:r>
-    </w:p>
-    <w:p>
-      <w:pPr>
-        <w:spacing w:after="0" w:line="360" w:lineRule="auto"/>
-        <w:rPr>
-          <w:rFonts w:ascii="Times New Roman" w:hAnsi="Times New Roman" w:cs="Times New Roman"/>
-          <w:b/>
-          <w:sz w:val="24"/>
-          <w:szCs w:val="24"/>
-        </w:rPr>
-      </w:pPr>
-      <w:r>
-        <w:rPr>
-          <w:rFonts w:ascii="Times New Roman" w:hAnsi="Times New Roman" w:cs="Times New Roman"/>
-          <w:b/>
-          <w:sz w:val="24"/>
-          <w:szCs w:val="24"/>
-        </w:rPr>
-        <w:t>Этап 1. Формирование векторов признаков</w:t>
-      </w:r>
-    </w:p>
-    <w:p>
-      <w:pPr>
-        <w:spacing w:after="0" w:line="360" w:lineRule="auto"/>
-        <w:rPr>
-          <w:rFonts w:ascii="Times New Roman" w:hAnsi="Times New Roman" w:cs="Times New Roman"/>
-          <w:sz w:val="24"/>
-          <w:szCs w:val="24"/>
-        </w:rPr>
-      </w:pPr>
-      <w:r>
-        <w:rPr>
-          <w:rFonts w:ascii="Times New Roman" w:hAnsi="Times New Roman" w:cs="Times New Roman"/>
-          <w:sz w:val="24"/>
-          <w:szCs w:val="24"/>
-        </w:rPr>
-        <w:t xml:space="preserve">Для каждого фильма сформировать бинарный вектор жанров: </w:t>
-      </w:r>
-      <w:proofErr w:type="spellStart"/>
-      <w:r>
-        <w:rPr>
-          <w:rFonts w:ascii="Times New Roman" w:hAnsi="Times New Roman" w:cs="Times New Roman"/>
-          <w:sz w:val="24"/>
-          <w:szCs w:val="24"/>
-        </w:rPr>
-        <w:t>xi</w:t>
-      </w:r>
-      <w:proofErr w:type="spellEnd"/>
-      <w:r>
         <w:rPr>
           <w:rFonts w:ascii="Times New Roman" w:hAnsi="Times New Roman" w:cs="Times New Roman"/>
           <w:sz w:val="24"/>
@@ -770,7 +711,7 @@
           <w:sz w:val="24"/>
           <w:szCs w:val="24"/>
         </w:rPr>
-        <w:t>1,gi</w:t>
+        <w:t>1,gi2,…</w:t>
       </w:r>
       <w:proofErr w:type="gramEnd"/>
       <w:r>
@@ -779,7 +720,7 @@
           <w:sz w:val="24"/>
           <w:szCs w:val="24"/>
         </w:rPr>
-        <w:t>2,…,</w:t>
+        <w:t>,</w:t>
       </w:r>
       <w:proofErr w:type="spellStart"/>
       <w:r>
@@ -899,7 +840,6 @@
                 <w:lang w:eastAsia="ru-RU"/>
               </w:rPr>
             </w:pPr>
-            <w:proofErr w:type="spellStart"/>
             <w:r>
               <w:rPr>
                 <w:rFonts w:ascii="Times New Roman" w:eastAsia="Times New Roman" w:hAnsi="Times New Roman" w:cs="Times New Roman"/>
@@ -911,7 +851,6 @@
               </w:rPr>
               <w:t>Action</w:t>
             </w:r>
-            <w:proofErr w:type="spellEnd"/>
           </w:p>
         </w:tc>
         <w:tc>
@@ -932,7 +871,6 @@
                 <w:lang w:eastAsia="ru-RU"/>
               </w:rPr>
             </w:pPr>
-            <w:proofErr w:type="spellStart"/>
             <w:r>
               <w:rPr>
                 <w:rFonts w:ascii="Times New Roman" w:eastAsia="Times New Roman" w:hAnsi="Times New Roman" w:cs="Times New Roman"/>
@@ -944,7 +882,6 @@
               </w:rPr>
               <w:t>Comedy</w:t>
             </w:r>
-            <w:proofErr w:type="spellEnd"/>
           </w:p>
         </w:tc>
         <w:tc>
@@ -1008,9 +945,20 @@
                 <w:szCs w:val="24"/>
                 <w:lang w:eastAsia="ru-RU"/>
               </w:rPr>
-              <w:t>Sci-Fi</w:t>
+              <w:t>Sci</w:t>
             </w:r>
             <w:proofErr w:type="spellEnd"/>
+            <w:r>
+              <w:rPr>
+                <w:rFonts w:ascii="Times New Roman" w:eastAsia="Times New Roman" w:hAnsi="Times New Roman" w:cs="Times New Roman"/>
+                <w:b/>
+                <w:bCs/>
+                <w:sz w:val="24"/>
+                <w:szCs w:val="24"/>
+                <w:lang w:eastAsia="ru-RU"/>
+              </w:rPr>
+              <w:t>-Fi</w:t>
+            </w:r>
           </w:p>
         </w:tc>
       </w:tr>
@@ -1467,7 +1415,7 @@
           <w:lang w:eastAsia="ru-RU"/>
         </w:rPr>
         <w:drawing>
-          <wp:inline distT="0" distB="0" distL="0" distR="0" wp14:anchorId="6B06FDE6" wp14:editId="28206596">
+          <wp:inline distT="0" distB="0" distL="0" distR="0" wp14:anchorId="48A14AED" wp14:editId="6EC43B83">
             <wp:extent cx="1584427" cy="455295"/>
             <wp:effectExtent l="0" t="0" r="0" b="1905"/>
             <wp:docPr id="3" name="Рисунок 3"/>
@@ -1618,7 +1566,69 @@
           <w:szCs w:val="24"/>
           <w:lang w:eastAsia="ru-RU"/>
         </w:rPr>
-        <w:t>Найти 10 наиболее похожих на него фильмов, исключая сам выбранный фильм.</w:t>
+        <w:t xml:space="preserve">Найти 10 наиболее </w:t>
+      </w:r>
+      <w:r>
+        <w:rPr>
+          <w:rFonts w:ascii="Times New Roman" w:eastAsia="Times New Roman" w:hAnsi="Times New Roman" w:cs="Times New Roman"/>
+          <w:sz w:val="24"/>
+          <w:szCs w:val="24"/>
+          <w:highlight w:val="green"/>
+          <w:lang w:eastAsia="ru-RU"/>
+        </w:rPr>
+        <w:t>похожих на него фильмов,</w:t>
+      </w:r>
+      <w:r>
+        <w:rPr>
+          <w:rFonts w:ascii="Times New Roman" w:eastAsia="Times New Roman" w:hAnsi="Times New Roman" w:cs="Times New Roman"/>
+          <w:sz w:val="24"/>
+          <w:szCs w:val="24"/>
+          <w:lang w:eastAsia="ru-RU"/>
+        </w:rPr>
+        <w:t xml:space="preserve"> исключая сам выбранный фильм.</w:t>
+      </w:r>
+    </w:p>
+    <w:p>
+      <w:pPr>
+        <w:numPr>
+          <w:ilvl w:val="0"/>
+          <w:numId w:val="15"/>
+        </w:numPr>
+        <w:spacing w:after="0" w:line="360" w:lineRule="auto"/>
+        <w:rPr>
+          <w:rFonts w:ascii="Times New Roman" w:eastAsia="Times New Roman" w:hAnsi="Times New Roman" w:cs="Times New Roman"/>
+          <w:sz w:val="24"/>
+          <w:szCs w:val="24"/>
+          <w:lang w:eastAsia="ru-RU"/>
+        </w:rPr>
+      </w:pPr>
+      <w:r>
+        <w:rPr>
+          <w:rFonts w:ascii="Times New Roman" w:eastAsia="Times New Roman" w:hAnsi="Times New Roman" w:cs="Times New Roman"/>
+          <w:sz w:val="24"/>
+          <w:szCs w:val="24"/>
+          <w:lang w:eastAsia="ru-RU"/>
+        </w:rPr>
+        <w:t xml:space="preserve">Вывести таблицу с названием фильма, </w:t>
+      </w:r>
+      <w:r>
+        <w:rPr>
+          <w:rFonts w:ascii="Times New Roman" w:eastAsia="Times New Roman" w:hAnsi="Times New Roman" w:cs="Times New Roman"/>
+          <w:sz w:val="24"/>
+          <w:szCs w:val="24"/>
+          <w:highlight w:val="green"/>
+          <w:lang w:eastAsia="ru-RU"/>
+        </w:rPr>
+        <w:t>жанрами и коэффиц</w:t>
+      </w:r>
+      <w:r>
+        <w:rPr>
+          <w:rFonts w:ascii="Times New Roman" w:eastAsia="Times New Roman" w:hAnsi="Times New Roman" w:cs="Times New Roman"/>
+          <w:sz w:val="24"/>
+          <w:szCs w:val="24"/>
+          <w:lang w:eastAsia="ru-RU"/>
+        </w:rPr>
+        <w:t>иентом сходства.</w:t>
       </w:r>
     </w:p>
     <w:p>
@@ -1642,15 +1652,30 @@
           <w:szCs w:val="24"/>
           <w:lang w:eastAsia="ru-RU"/>
         </w:rPr>
-        <w:t>Вывести таблицу с названием фильма, жанрами и коэффициентом сходства.</w:t>
-      </w:r>
-    </w:p>
-    <w:p>
-      <w:pPr>
-        <w:numPr>
-          <w:ilvl w:val="0"/>
-          <w:numId w:val="13"/>
-        </w:numPr>
+        <w:t xml:space="preserve">Построить </w:t>
+      </w:r>
+      <w:r>
+        <w:rPr>
+          <w:rFonts w:ascii="Times New Roman" w:eastAsia="Times New Roman" w:hAnsi="Times New Roman" w:cs="Times New Roman"/>
+          <w:sz w:val="24"/>
+          <w:szCs w:val="24"/>
+          <w:highlight w:val="green"/>
+          <w:lang w:eastAsia="ru-RU"/>
+        </w:rPr>
+        <w:t>тепловую карту сходства</w:t>
+      </w:r>
+      <w:r>
+        <w:rPr>
+          <w:rFonts w:ascii="Times New Roman" w:eastAsia="Times New Roman" w:hAnsi="Times New Roman" w:cs="Times New Roman"/>
+          <w:sz w:val="24"/>
+          <w:szCs w:val="24"/>
+          <w:lang w:eastAsia="ru-RU"/>
+        </w:rPr>
+        <w:t xml:space="preserve"> для выбранного фильма и пяти наиболее похожих объектов.</w:t>
+      </w:r>
+    </w:p>
+    <w:p>
+      <w:pPr>
         <w:spacing w:after="0" w:line="360" w:lineRule="auto"/>
         <w:rPr>
           <w:rFonts w:ascii="Times New Roman" w:eastAsia="Times New Roman" w:hAnsi="Times New Roman" w:cs="Times New Roman"/>
@@ -1666,7 +1691,26 @@
           <w:szCs w:val="24"/>
           <w:lang w:eastAsia="ru-RU"/>
         </w:rPr>
-        <w:t>Построить тепловую карту сходства для выбранного фильма и пяти наиболее похожих объектов.</w:t>
+        <w:t xml:space="preserve">Результат: Top-10 </w:t>
+      </w:r>
+      <w:r>
+        <w:rPr>
+          <w:rFonts w:ascii="Times New Roman" w:eastAsia="Times New Roman" w:hAnsi="Times New Roman" w:cs="Times New Roman"/>
+          <w:sz w:val="24"/>
+          <w:szCs w:val="24"/>
+          <w:highlight w:val="green"/>
+          <w:lang w:eastAsia="ru-RU"/>
+        </w:rPr>
+        <w:t>похожих фильмов и визуализация</w:t>
+      </w:r>
+      <w:r>
+        <w:rPr>
+          <w:rFonts w:ascii="Times New Roman" w:eastAsia="Times New Roman" w:hAnsi="Times New Roman" w:cs="Times New Roman"/>
+          <w:sz w:val="24"/>
+          <w:szCs w:val="24"/>
+          <w:lang w:eastAsia="ru-RU"/>
+        </w:rPr>
+        <w:t xml:space="preserve"> сходства.</w:t>
       </w:r>
     </w:p>
     <w:p>
@@ -1686,27 +1730,17 @@
           <w:szCs w:val="24"/>
           <w:lang w:eastAsia="ru-RU"/>
         </w:rPr>
-        <w:t>Результат: Top-10 похожих фильмов и визуализация сходства.</w:t>
-      </w:r>
-    </w:p>
-    <w:p>
-      <w:pPr>
-        <w:spacing w:after="0" w:line="360" w:lineRule="auto"/>
-        <w:rPr>
-          <w:rFonts w:ascii="Times New Roman" w:eastAsia="Times New Roman" w:hAnsi="Times New Roman" w:cs="Times New Roman"/>
-          <w:sz w:val="24"/>
-          <w:szCs w:val="24"/>
+        <w:t xml:space="preserve">Вывод: объяснить, </w:t>
+      </w:r>
+      <w:r>
+        <w:rPr>
+          <w:rFonts w:ascii="Times New Roman" w:eastAsia="Times New Roman" w:hAnsi="Times New Roman" w:cs="Times New Roman"/>
+          <w:sz w:val="24"/>
+          <w:szCs w:val="24"/>
+          <w:highlight w:val="green"/>
           <w:lang w:eastAsia="ru-RU"/>
         </w:rPr>
-      </w:pPr>
-      <w:r>
-        <w:rPr>
-          <w:rFonts w:ascii="Times New Roman" w:eastAsia="Times New Roman" w:hAnsi="Times New Roman" w:cs="Times New Roman"/>
-          <w:sz w:val="24"/>
-          <w:szCs w:val="24"/>
-          <w:lang w:eastAsia="ru-RU"/>
-        </w:rPr>
-        <w:t>Вывод: объяснить, почему определённые фильмы оказались похожими, и указать ограничения сравнения только по жанрам.</w:t>
+        <w:t>почему определённые фильмы оказались похожими, и указать ограничения сравнения только по жанрам.</w:t>
       </w:r>
     </w:p>
     <w:p>
@@ -1718,73 +1752,68 @@
         <w:lastRenderedPageBreak/>
         <w:t xml:space="preserve">Задание 3. </w:t>
       </w:r>
+      <w:r>
+        <w:t xml:space="preserve">Content-Based </w:t>
+      </w:r>
       <w:proofErr w:type="spellStart"/>
       <w:r>
-        <w:t>Content-Based</w:t>
+        <w:t>Filtering</w:t>
       </w:r>
       <w:proofErr w:type="spellEnd"/>
       <w:r>
+        <w:t>: персонализированные рекомендации</w:t>
+      </w:r>
+    </w:p>
+    <w:p>
+      <w:pPr>
+        <w:pStyle w:val="a3"/>
+        <w:spacing w:before="0" w:beforeAutospacing="0" w:after="0" w:afterAutospacing="0" w:line="360" w:lineRule="auto"/>
+      </w:pPr>
+      <w:r>
+        <w:t>Разработать контентный рекомендательный алгоритм на основе жанровых предпочтений конкретного пользователя.</w:t>
+      </w:r>
+    </w:p>
+    <w:p>
+      <w:pPr>
+        <w:pStyle w:val="a3"/>
+        <w:spacing w:before="0" w:beforeAutospacing="0" w:after="0" w:afterAutospacing="0" w:line="360" w:lineRule="auto"/>
+      </w:pPr>
+      <w:r>
+        <w:t>Выбрать пользователя, имеющего не менее 20 оценок. Для сопоставимости желательно использовать того же пользователя, который исследовался в лабораторной работе №1.</w:t>
+      </w:r>
+    </w:p>
+    <w:p>
+      <w:pPr>
+        <w:pStyle w:val="a3"/>
+        <w:spacing w:before="0" w:beforeAutospacing="0" w:after="0" w:afterAutospacing="0" w:line="360" w:lineRule="auto"/>
+        <w:rPr>
+          <w:b/>
+        </w:rPr>
+      </w:pPr>
+      <w:r>
+        <w:rPr>
+          <w:b/>
+        </w:rPr>
+        <w:t>Этап 1. Построение профиля пользователя</w:t>
+      </w:r>
+    </w:p>
+    <w:p>
+      <w:pPr>
+        <w:pStyle w:val="a3"/>
+        <w:spacing w:before="0" w:beforeAutospacing="0" w:after="0" w:afterAutospacing="0" w:line="360" w:lineRule="auto"/>
+      </w:pPr>
+      <w:r>
+        <w:t>Профиль пользователя формируется как средневзвешенный вектор признаков оценённых им фильмов:</w:t>
+      </w:r>
+      <w:r>
         <w:t xml:space="preserve"> </w:t>
       </w:r>
-      <w:proofErr w:type="spellStart"/>
-      <w:r>
-        <w:t>Filtering</w:t>
-      </w:r>
-      <w:proofErr w:type="spellEnd"/>
-      <w:r>
-        <w:t>: персонализированные рекомендации</w:t>
-      </w:r>
-    </w:p>
-    <w:p>
-      <w:pPr>
-        <w:pStyle w:val="a3"/>
-        <w:spacing w:before="0" w:beforeAutospacing="0" w:after="0" w:afterAutospacing="0" w:line="360" w:lineRule="auto"/>
-      </w:pPr>
-      <w:r>
-        <w:t>Разработать контентный рекомендательный алгоритм на основе жанровых предпочтений конкретного пользователя.</w:t>
-      </w:r>
-    </w:p>
-    <w:p>
-      <w:pPr>
-        <w:pStyle w:val="a3"/>
-        <w:spacing w:before="0" w:beforeAutospacing="0" w:after="0" w:afterAutospacing="0" w:line="360" w:lineRule="auto"/>
-      </w:pPr>
-      <w:r>
-        <w:t>Выбрать пользователя, имеющего не менее 20 оценок. Для сопоставимости желательно использовать того же пользователя, который исследовался в лабораторной работе №1.</w:t>
-      </w:r>
-    </w:p>
-    <w:p>
-      <w:pPr>
-        <w:pStyle w:val="a3"/>
-        <w:spacing w:before="0" w:beforeAutospacing="0" w:after="0" w:afterAutospacing="0" w:line="360" w:lineRule="auto"/>
-        <w:rPr>
-          <w:b/>
-        </w:rPr>
-      </w:pPr>
-      <w:r>
-        <w:rPr>
-          <w:b/>
-        </w:rPr>
-        <w:t>Этап 1. Построение профиля пользователя</w:t>
-      </w:r>
-    </w:p>
-    <w:p>
-      <w:pPr>
-        <w:pStyle w:val="a3"/>
-        <w:spacing w:before="0" w:beforeAutospacing="0" w:after="0" w:afterAutospacing="0" w:line="360" w:lineRule="auto"/>
-      </w:pPr>
-      <w:r>
-        <w:t>Профиль пользователя формируется как средневзвешенный вектор признаков оценённых им фильмов:</w:t>
-      </w:r>
-      <w:r>
-        <w:t xml:space="preserve"> </w:t>
-      </w:r>
       <w:r>
         <w:rPr>
           <w:noProof/>
         </w:rPr>
         <w:drawing>
-          <wp:inline distT="0" distB="0" distL="0" distR="0" wp14:anchorId="50A5B14F" wp14:editId="5082F9E0">
+          <wp:inline distT="0" distB="0" distL="0" distR="0" wp14:anchorId="792C137D" wp14:editId="2AF488D7">
             <wp:extent cx="1374040" cy="701040"/>
             <wp:effectExtent l="0" t="0" r="0" b="3810"/>
             <wp:docPr id="1" name="Рисунок 1"/>
@@ -2090,6 +2119,7 @@
         <w:t>(</w:t>
       </w:r>
       <w:proofErr w:type="spellStart"/>
+      <w:proofErr w:type="gramStart"/>
       <w:r>
         <w:rPr>
           <w:rFonts w:ascii="Times New Roman" w:eastAsia="Times New Roman" w:hAnsi="Times New Roman" w:cs="Times New Roman"/>
@@ -2138,6 +2168,7 @@
         </w:rPr>
         <w:t>i</w:t>
       </w:r>
+      <w:proofErr w:type="gramEnd"/>
       <w:r>
         <w:rPr>
           <w:rFonts w:ascii="Times New Roman" w:eastAsia="Times New Roman" w:hAnsi="Times New Roman" w:cs="Times New Roman"/>
@@ -2191,27 +2222,7 @@
           <w:szCs w:val="24"/>
           <w:lang w:eastAsia="ru-RU"/>
         </w:rPr>
-        <w:t xml:space="preserve">Выбрать пользователя с не менее чем 20 оценками </w:t>
-      </w:r>
-      <w:proofErr w:type="gramStart"/>
-      <w:r>
-        <w:rPr>
-          <w:rFonts w:ascii="Times New Roman" w:eastAsia="Times New Roman" w:hAnsi="Times New Roman" w:cs="Times New Roman"/>
-          <w:sz w:val="24"/>
-          <w:szCs w:val="24"/>
-          <w:lang w:eastAsia="ru-RU"/>
-        </w:rPr>
-        <w:t>и</w:t>
-      </w:r>
-      <w:proofErr w:type="gramEnd"/>
-      <w:r>
-        <w:rPr>
-          <w:rFonts w:ascii="Times New Roman" w:eastAsia="Times New Roman" w:hAnsi="Times New Roman" w:cs="Times New Roman"/>
-          <w:sz w:val="24"/>
-          <w:szCs w:val="24"/>
-          <w:lang w:eastAsia="ru-RU"/>
-        </w:rPr>
-        <w:t xml:space="preserve"> хотя бы одной положительной оценкой.</w:t>
+        <w:t>Выбрать пользователя с не менее чем 20 оценками и хотя бы одной положительной оценкой.</w:t>
       </w:r>
     </w:p>
     <w:p>
@@ -2440,9 +2451,12 @@
         <w:lastRenderedPageBreak/>
         <w:t xml:space="preserve">Задание 4. </w:t>
       </w:r>
+      <w:r>
+        <w:t xml:space="preserve">User-Based </w:t>
+      </w:r>
       <w:proofErr w:type="spellStart"/>
       <w:r>
-        <w:t>User-Based</w:t>
+        <w:t>Collaborative</w:t>
       </w:r>
       <w:proofErr w:type="spellEnd"/>
       <w:r>
@@ -2450,17 +2464,9 @@
       </w:r>
       <w:proofErr w:type="spellStart"/>
       <w:r>
-        <w:t>Collaborative</w:t>
+        <w:t>Filtering</w:t>
       </w:r>
       <w:proofErr w:type="spellEnd"/>
-      <w:r>
-        <w:t xml:space="preserve"> </w:t>
-      </w:r>
-      <w:proofErr w:type="spellStart"/>
-      <w:r>
-        <w:t>Filtering</w:t>
-      </w:r>
-      <w:proofErr w:type="spellEnd"/>
     </w:p>
     <w:p>
       <w:pPr>
@@ -2514,7 +2520,7 @@
           <w:noProof/>
         </w:rPr>
         <w:drawing>
-          <wp:inline distT="0" distB="0" distL="0" distR="0" wp14:anchorId="0071D54C" wp14:editId="276E8166">
+          <wp:inline distT="0" distB="0" distL="0" distR="0" wp14:anchorId="02325F46" wp14:editId="617DB8A0">
             <wp:extent cx="2506980" cy="702714"/>
             <wp:effectExtent l="0" t="0" r="7620" b="2540"/>
             <wp:docPr id="4" name="Рисунок 4"/>
@@ -2732,7 +2738,7 @@
           <w:noProof/>
         </w:rPr>
         <w:drawing>
-          <wp:inline distT="0" distB="0" distL="0" distR="0" wp14:anchorId="2F88F4DE" wp14:editId="4CD234A9">
+          <wp:inline distT="0" distB="0" distL="0" distR="0" wp14:anchorId="2F20B4CF" wp14:editId="14C53C26">
             <wp:extent cx="2019300" cy="708761"/>
             <wp:effectExtent l="0" t="0" r="0" b="0"/>
             <wp:docPr id="5" name="Рисунок 5"/>
@@ -2777,85 +2783,61 @@
         <w:spacing w:before="0" w:beforeAutospacing="0" w:after="0" w:afterAutospacing="0" w:line="360" w:lineRule="auto"/>
       </w:pPr>
       <w:r>
-        <w:t xml:space="preserve">где </w:t>
+        <w:t>где Ni(u) – выбранные ближайшие соседи, имеющие оценку фильма i.</w:t>
+      </w:r>
+    </w:p>
+    <w:p>
+      <w:pPr>
+        <w:pStyle w:val="a3"/>
+        <w:spacing w:before="0" w:beforeAutospacing="0" w:after="0" w:afterAutospacing="0" w:line="360" w:lineRule="auto"/>
+      </w:pPr>
+      <w:r>
+        <w:t>Если ни один из найденных соседей не оценивал фильм, прогноз по User-Based CF не рассчитывается.</w:t>
+      </w:r>
+    </w:p>
+    <w:p>
+      <w:pPr>
+        <w:pStyle w:val="a3"/>
+        <w:spacing w:before="0" w:beforeAutospacing="0" w:after="0" w:afterAutospacing="0" w:line="360" w:lineRule="auto"/>
+      </w:pPr>
+      <w:r>
+        <w:t>Необходимо сформировать Top-5 фильмов с наибольшими прогнозируемыми оценками. Если допустимых кандидатов меньше пяти, вывести доступное количество и пояснить причину.</w:t>
+      </w:r>
+    </w:p>
+    <w:p>
+      <w:pPr>
+        <w:pStyle w:val="a3"/>
+        <w:spacing w:before="0" w:beforeAutospacing="0" w:after="0" w:afterAutospacing="0" w:line="360" w:lineRule="auto"/>
+      </w:pPr>
+      <w:r>
+        <w:lastRenderedPageBreak/>
+        <w:t>Результат: ближайшие соседи пользователя и персонализированные рекомендации User-Based CF.</w:t>
+      </w:r>
+    </w:p>
+    <w:p>
+      <w:pPr>
+        <w:pStyle w:val="a3"/>
+        <w:spacing w:before="0" w:beforeAutospacing="0" w:after="0" w:afterAutospacing="0" w:line="360" w:lineRule="auto"/>
+      </w:pPr>
+      <w:r>
+        <w:t>Вывод: объяснить, почему выбранные пользователи оказались соседями и как их оценки повлияли на итоговые рекомендации.</w:t>
+      </w:r>
+    </w:p>
+    <w:p>
+      <w:pPr>
+        <w:pStyle w:val="2"/>
+        <w:spacing w:before="0" w:beforeAutospacing="0" w:after="0" w:afterAutospacing="0" w:line="360" w:lineRule="auto"/>
+      </w:pPr>
+      <w:r>
+        <w:t xml:space="preserve">Задание 5. </w:t>
       </w:r>
       <w:proofErr w:type="spellStart"/>
       <w:r>
-        <w:t>Ni</w:t>
+        <w:t>Item</w:t>
       </w:r>
       <w:proofErr w:type="spellEnd"/>
       <w:r>
-        <w:t>(u) – выбранные ближайшие соседи, имеющие оценку фильма i.</w:t>
-      </w:r>
-    </w:p>
-    <w:p>
-      <w:pPr>
-        <w:pStyle w:val="a3"/>
-        <w:spacing w:before="0" w:beforeAutospacing="0" w:after="0" w:afterAutospacing="0" w:line="360" w:lineRule="auto"/>
-      </w:pPr>
-      <w:r>
-        <w:t xml:space="preserve">Если ни один из найденных соседей не оценивал фильм, прогноз по </w:t>
-      </w:r>
-      <w:proofErr w:type="spellStart"/>
-      <w:r>
-        <w:t>User-Based</w:t>
-      </w:r>
-      <w:proofErr w:type="spellEnd"/>
-      <w:r>
-        <w:t xml:space="preserve"> CF не рассчитывается.</w:t>
-      </w:r>
-    </w:p>
-    <w:p>
-      <w:pPr>
-        <w:pStyle w:val="a3"/>
-        <w:spacing w:before="0" w:beforeAutospacing="0" w:after="0" w:afterAutospacing="0" w:line="360" w:lineRule="auto"/>
-      </w:pPr>
-      <w:r>
-        <w:t>Необходимо сформировать Top-5 фильмов с наибольшими прогнозируемыми оценками. Если допустимых кандидатов меньше пяти, вывести доступное количество и пояснить причину.</w:t>
-      </w:r>
-    </w:p>
-    <w:p>
-      <w:pPr>
-        <w:pStyle w:val="a3"/>
-        <w:spacing w:before="0" w:beforeAutospacing="0" w:after="0" w:afterAutospacing="0" w:line="360" w:lineRule="auto"/>
-      </w:pPr>
-      <w:r>
-        <w:lastRenderedPageBreak/>
-        <w:t xml:space="preserve">Результат: ближайшие соседи пользователя и персонализированные рекомендации </w:t>
-      </w:r>
-      <w:proofErr w:type="spellStart"/>
-      <w:r>
-        <w:t>User-Based</w:t>
-      </w:r>
-      <w:proofErr w:type="spellEnd"/>
-      <w:r>
-        <w:t xml:space="preserve"> CF.</w:t>
-      </w:r>
-    </w:p>
-    <w:p>
-      <w:pPr>
-        <w:pStyle w:val="a3"/>
-        <w:spacing w:before="0" w:beforeAutospacing="0" w:after="0" w:afterAutospacing="0" w:line="360" w:lineRule="auto"/>
-      </w:pPr>
-      <w:r>
-        <w:t>Вывод: объяснить, почему выбранные пользователи оказались соседями и как их оценки повлияли на итоговые рекомендации.</w:t>
-      </w:r>
-    </w:p>
-    <w:p>
-      <w:pPr>
-        <w:pStyle w:val="2"/>
-        <w:spacing w:before="0" w:beforeAutospacing="0" w:after="0" w:afterAutospacing="0" w:line="360" w:lineRule="auto"/>
-      </w:pPr>
-      <w:r>
-        <w:t xml:space="preserve">Задание 5. </w:t>
-      </w:r>
-      <w:proofErr w:type="spellStart"/>
-      <w:r>
-        <w:t>Item-Based</w:t>
-      </w:r>
-      <w:proofErr w:type="spellEnd"/>
-      <w:r>
-        <w:t xml:space="preserve"> </w:t>
+        <w:t xml:space="preserve">-Based </w:t>
       </w:r>
       <w:proofErr w:type="spellStart"/>
       <w:r>
@@ -2929,7 +2911,7 @@
           <w:noProof/>
         </w:rPr>
         <w:drawing>
-          <wp:inline distT="0" distB="0" distL="0" distR="0" wp14:anchorId="37807A8A" wp14:editId="7E0ADED0">
+          <wp:inline distT="0" distB="0" distL="0" distR="0" wp14:anchorId="6DA13433" wp14:editId="5C5C83C8">
             <wp:extent cx="2994660" cy="821664"/>
             <wp:effectExtent l="0" t="0" r="0" b="0"/>
             <wp:docPr id="6" name="Рисунок 6"/>
@@ -3028,7 +3010,7 @@
           <w:noProof/>
         </w:rPr>
         <w:drawing>
-          <wp:inline distT="0" distB="0" distL="0" distR="0" wp14:anchorId="6A40C1C5" wp14:editId="653419AC">
+          <wp:inline distT="0" distB="0" distL="0" distR="0" wp14:anchorId="64388837" wp14:editId="67CE89C8">
             <wp:extent cx="2847975" cy="895350"/>
             <wp:effectExtent l="0" t="0" r="9525" b="0"/>
             <wp:docPr id="7" name="Рисунок 7"/>
@@ -3185,11 +3167,11 @@
       </w:r>
       <w:proofErr w:type="spellStart"/>
       <w:r>
-        <w:t>Item-Based</w:t>
+        <w:t>Item</w:t>
       </w:r>
       <w:proofErr w:type="spellEnd"/>
       <w:r>
-        <w:t xml:space="preserve"> CF.</w:t>
+        <w:t>-Based CF.</w:t>
       </w:r>
     </w:p>
     <w:p>
@@ -3256,11 +3238,11 @@
       </w:r>
       <w:proofErr w:type="spellStart"/>
       <w:r>
-        <w:t>Popularity-Based</w:t>
+        <w:t>Popularity</w:t>
       </w:r>
       <w:proofErr w:type="spellEnd"/>
       <w:r>
-        <w:t xml:space="preserve"> из лабораторной работы №1;</w:t>
+        <w:t>-Based из лабораторной работы №1;</w:t>
       </w:r>
     </w:p>
     <w:p>
@@ -3303,11 +3285,11 @@
       </w:r>
       <w:proofErr w:type="spellStart"/>
       <w:r>
-        <w:t>Item-Based</w:t>
+        <w:t>Item</w:t>
       </w:r>
       <w:proofErr w:type="spellEnd"/>
       <w:r>
-        <w:t xml:space="preserve"> CF.</w:t>
+        <w:t>-Based CF.</w:t>
       </w:r>
     </w:p>
     <w:p>
@@ -3512,9 +3494,18 @@
                 <w:szCs w:val="24"/>
                 <w:lang w:eastAsia="ru-RU"/>
               </w:rPr>
-              <w:t>Popularity-Based</w:t>
+              <w:t>Popularity</w:t>
             </w:r>
             <w:proofErr w:type="spellEnd"/>
+            <w:r>
+              <w:rPr>
+                <w:rFonts w:ascii="Times New Roman" w:eastAsia="Times New Roman" w:hAnsi="Times New Roman" w:cs="Times New Roman"/>
+                <w:sz w:val="24"/>
+                <w:szCs w:val="24"/>
+                <w:lang w:eastAsia="ru-RU"/>
+              </w:rPr>
+              <w:t>-Based</w:t>
+            </w:r>
           </w:p>
         </w:tc>
         <w:tc>
@@ -3612,7 +3603,6 @@
                 <w:lang w:eastAsia="ru-RU"/>
               </w:rPr>
             </w:pPr>
-            <w:proofErr w:type="spellStart"/>
             <w:r>
               <w:rPr>
                 <w:rFonts w:ascii="Times New Roman" w:eastAsia="Times New Roman" w:hAnsi="Times New Roman" w:cs="Times New Roman"/>
@@ -3622,7 +3612,6 @@
               </w:rPr>
               <w:t>Content-Based</w:t>
             </w:r>
-            <w:proofErr w:type="spellEnd"/>
           </w:p>
         </w:tc>
         <w:tc>
@@ -3720,7 +3709,6 @@
                 <w:lang w:eastAsia="ru-RU"/>
               </w:rPr>
             </w:pPr>
-            <w:proofErr w:type="spellStart"/>
             <w:r>
               <w:rPr>
                 <w:rFonts w:ascii="Times New Roman" w:eastAsia="Times New Roman" w:hAnsi="Times New Roman" w:cs="Times New Roman"/>
@@ -3728,17 +3716,7 @@
                 <w:szCs w:val="24"/>
                 <w:lang w:eastAsia="ru-RU"/>
               </w:rPr>
-              <w:t>User-Based</w:t>
-            </w:r>
-            <w:proofErr w:type="spellEnd"/>
-            <w:r>
-              <w:rPr>
-                <w:rFonts w:ascii="Times New Roman" w:eastAsia="Times New Roman" w:hAnsi="Times New Roman" w:cs="Times New Roman"/>
-                <w:sz w:val="24"/>
-                <w:szCs w:val="24"/>
-                <w:lang w:eastAsia="ru-RU"/>
-              </w:rPr>
-              <w:t xml:space="preserve"> CF</w:t>
+              <w:t>User-Based CF</w:t>
             </w:r>
           </w:p>
         </w:tc>
@@ -3845,7 +3823,7 @@
                 <w:szCs w:val="24"/>
                 <w:lang w:eastAsia="ru-RU"/>
               </w:rPr>
-              <w:t>Item-Based</w:t>
+              <w:t>Item</w:t>
             </w:r>
             <w:proofErr w:type="spellEnd"/>
             <w:r>
@@ -3855,7 +3833,7 @@
                 <w:szCs w:val="24"/>
                 <w:lang w:eastAsia="ru-RU"/>
               </w:rPr>
-              <w:t xml:space="preserve"> CF</w:t>
+              <w:t>-Based CF</w:t>
             </w:r>
           </w:p>
         </w:tc>
@@ -3968,12 +3946,7 @@
         <w:t>Р</w:t>
       </w:r>
       <w:r>
-        <w:t xml:space="preserve">езультат: сравнительная таблица </w:t>
-      </w:r>
-      <w:bookmarkStart w:id="0" w:name="_GoBack"/>
-      <w:bookmarkEnd w:id="0"/>
-      <w:r>
-        <w:t>четырёх алгоритмов.</w:t>
+        <w:t>езультат: сравнительная таблица четырёх алгоритмов.</w:t>
       </w:r>
     </w:p>
     <w:p>
@@ -4000,7 +3973,7 @@
           <w:sz w:val="27"/>
           <w:szCs w:val="27"/>
         </w:rPr>
-        <w:t xml:space="preserve">. Требования к оформлению </w:t>
+        <w:t xml:space="preserve">. Требования к оформлению Google </w:t>
       </w:r>
       <w:proofErr w:type="spellStart"/>
       <w:r>
@@ -4009,7 +3982,7 @@
           <w:sz w:val="27"/>
           <w:szCs w:val="27"/>
         </w:rPr>
-        <w:t>Google</w:t>
+        <w:t>Colab</w:t>
       </w:r>
       <w:proofErr w:type="spellEnd"/>
       <w:r>
@@ -4027,178 +4000,245 @@
           <w:sz w:val="27"/>
           <w:szCs w:val="27"/>
         </w:rPr>
-        <w:t>Colab</w:t>
+        <w:t>Notebook</w:t>
       </w:r>
       <w:proofErr w:type="spellEnd"/>
-      <w:r>
-        <w:rPr>
-          <w:kern w:val="0"/>
-          <w:sz w:val="27"/>
-          <w:szCs w:val="27"/>
-        </w:rPr>
+    </w:p>
+    <w:p>
+      <w:pPr>
+        <w:pStyle w:val="a3"/>
+        <w:spacing w:before="0" w:beforeAutospacing="0" w:after="0" w:afterAutospacing="0" w:line="360" w:lineRule="auto"/>
+      </w:pPr>
+      <w:r>
+        <w:t>Итоговый файл должен иметь название:</w:t>
+      </w:r>
+    </w:p>
+    <w:p>
+      <w:pPr>
+        <w:pStyle w:val="a3"/>
+        <w:spacing w:before="0" w:beforeAutospacing="0" w:after="0" w:afterAutospacing="0" w:line="360" w:lineRule="auto"/>
+        <w:rPr>
+          <w:rStyle w:val="HTML"/>
+          <w:rFonts w:ascii="Times New Roman" w:hAnsi="Times New Roman" w:cs="Times New Roman"/>
+        </w:rPr>
+      </w:pPr>
+      <w:r>
+        <w:rPr>
+          <w:rStyle w:val="HTML"/>
+          <w:rFonts w:ascii="Times New Roman" w:hAnsi="Times New Roman" w:cs="Times New Roman"/>
+        </w:rPr>
+        <w:t>РекСис_ЛР</w:t>
+      </w:r>
+      <w:r>
+        <w:rPr>
+          <w:rStyle w:val="HTML"/>
+          <w:rFonts w:ascii="Times New Roman" w:hAnsi="Times New Roman" w:cs="Times New Roman"/>
+        </w:rPr>
+        <w:t>2</w:t>
+      </w:r>
+      <w:r>
+        <w:rPr>
+          <w:rStyle w:val="HTML"/>
+          <w:rFonts w:ascii="Times New Roman" w:hAnsi="Times New Roman" w:cs="Times New Roman"/>
+        </w:rPr>
+        <w:t>_23_ИИ_ФамилияИО_Вариант_</w:t>
+      </w:r>
+      <w:proofErr w:type="gramStart"/>
+      <w:r>
+        <w:rPr>
+          <w:rStyle w:val="HTML"/>
+          <w:rFonts w:ascii="Times New Roman" w:hAnsi="Times New Roman" w:cs="Times New Roman"/>
+        </w:rPr>
+        <w:t>0.ipynb</w:t>
+      </w:r>
+      <w:proofErr w:type="gramEnd"/>
+    </w:p>
+    <w:p>
+      <w:pPr>
+        <w:pStyle w:val="a3"/>
+        <w:spacing w:before="0" w:beforeAutospacing="0" w:after="0" w:afterAutospacing="0" w:line="360" w:lineRule="auto"/>
+      </w:pPr>
+      <w:r>
+        <w:t>Ноутбук должен содержать следующую структуру:</w:t>
+      </w:r>
+    </w:p>
+    <w:p>
+      <w:pPr>
+        <w:pStyle w:val="a3"/>
+        <w:spacing w:before="0" w:beforeAutospacing="0" w:after="0" w:afterAutospacing="0" w:line="360" w:lineRule="auto"/>
+      </w:pPr>
+      <w:r>
+        <w:t>1. Титульная ячейка с ФИО, группой и номером варианта.</w:t>
+      </w:r>
+    </w:p>
+    <w:p>
+      <w:pPr>
+        <w:pStyle w:val="a3"/>
+        <w:spacing w:before="0" w:beforeAutospacing="0" w:after="0" w:afterAutospacing="0" w:line="360" w:lineRule="auto"/>
+      </w:pPr>
+      <w:r>
+        <w:t>2. Цель лабораторной работы.</w:t>
+      </w:r>
+    </w:p>
+    <w:p>
+      <w:pPr>
+        <w:pStyle w:val="a3"/>
+        <w:spacing w:before="0" w:beforeAutospacing="0" w:after="0" w:afterAutospacing="0" w:line="360" w:lineRule="auto"/>
+      </w:pPr>
+      <w:r>
+        <w:t>3. Загрузка библиотек и данных.</w:t>
+      </w:r>
+    </w:p>
+    <w:p>
+      <w:pPr>
+        <w:pStyle w:val="a3"/>
+        <w:spacing w:before="0" w:beforeAutospacing="0" w:after="0" w:afterAutospacing="0" w:line="360" w:lineRule="auto"/>
+      </w:pPr>
+      <w:r>
+        <w:t>4. Подготовка пользовательских оценок и характеристик фильмов.</w:t>
+      </w:r>
+    </w:p>
+    <w:p>
+      <w:pPr>
+        <w:pStyle w:val="a3"/>
+        <w:spacing w:before="0" w:beforeAutospacing="0" w:after="0" w:afterAutospacing="0" w:line="360" w:lineRule="auto"/>
+      </w:pPr>
+      <w:r>
+        <w:t xml:space="preserve">5. Content-Based </w:t>
+      </w:r>
+      <w:proofErr w:type="spellStart"/>
+      <w:r>
+        <w:t>Filtering</w:t>
+      </w:r>
+      <w:proofErr w:type="spellEnd"/>
+      <w:r>
+        <w:t>: вычисление сходства фильмов.</w:t>
+      </w:r>
+    </w:p>
+    <w:p>
+      <w:pPr>
+        <w:pStyle w:val="a3"/>
+        <w:spacing w:before="0" w:beforeAutospacing="0" w:after="0" w:afterAutospacing="0" w:line="360" w:lineRule="auto"/>
+      </w:pPr>
+      <w:r>
+        <w:lastRenderedPageBreak/>
+        <w:t xml:space="preserve">6. </w:t>
+      </w:r>
+      <w:r>
+        <w:rPr>
+          <w:lang w:val="en-US"/>
+        </w:rPr>
+        <w:t>Content</w:t>
+      </w:r>
+      <w:r>
+        <w:t>-</w:t>
+      </w:r>
+      <w:r>
+        <w:rPr>
+          <w:lang w:val="en-US"/>
+        </w:rPr>
+        <w:t>Based</w:t>
+      </w:r>
+      <w:r>
         <w:t xml:space="preserve"> </w:t>
       </w:r>
-      <w:proofErr w:type="spellStart"/>
-      <w:r>
-        <w:rPr>
-          <w:kern w:val="0"/>
-          <w:sz w:val="27"/>
-          <w:szCs w:val="27"/>
-        </w:rPr>
-        <w:t>Notebook</w:t>
-      </w:r>
-      <w:proofErr w:type="spellEnd"/>
-    </w:p>
-    <w:p>
-      <w:pPr>
-        <w:pStyle w:val="a3"/>
-        <w:spacing w:before="0" w:beforeAutospacing="0" w:after="0" w:afterAutospacing="0" w:line="360" w:lineRule="auto"/>
-      </w:pPr>
-      <w:r>
-        <w:t>Итоговый файл должен иметь название:</w:t>
-      </w:r>
-    </w:p>
-    <w:p>
-      <w:pPr>
-        <w:pStyle w:val="a3"/>
-        <w:spacing w:before="0" w:beforeAutospacing="0" w:after="0" w:afterAutospacing="0" w:line="360" w:lineRule="auto"/>
-        <w:rPr>
-          <w:rStyle w:val="HTML"/>
-          <w:rFonts w:ascii="Times New Roman" w:hAnsi="Times New Roman" w:cs="Times New Roman"/>
-        </w:rPr>
-      </w:pPr>
-      <w:r>
-        <w:rPr>
-          <w:rStyle w:val="HTML"/>
-          <w:rFonts w:ascii="Times New Roman" w:hAnsi="Times New Roman" w:cs="Times New Roman"/>
-        </w:rPr>
-        <w:t>РекСис_ЛР</w:t>
-      </w:r>
-      <w:r>
-        <w:rPr>
-          <w:rStyle w:val="HTML"/>
-          <w:rFonts w:ascii="Times New Roman" w:hAnsi="Times New Roman" w:cs="Times New Roman"/>
-        </w:rPr>
-        <w:t>2</w:t>
-      </w:r>
-      <w:r>
-        <w:rPr>
-          <w:rStyle w:val="HTML"/>
-          <w:rFonts w:ascii="Times New Roman" w:hAnsi="Times New Roman" w:cs="Times New Roman"/>
-        </w:rPr>
-        <w:t>_23_ИИ_ФамилияИО_Вариант_</w:t>
-      </w:r>
-      <w:proofErr w:type="gramStart"/>
-      <w:r>
-        <w:rPr>
-          <w:rStyle w:val="HTML"/>
-          <w:rFonts w:ascii="Times New Roman" w:hAnsi="Times New Roman" w:cs="Times New Roman"/>
-        </w:rPr>
-        <w:t>0.ipynb</w:t>
-      </w:r>
-      <w:proofErr w:type="gramEnd"/>
-    </w:p>
-    <w:p>
-      <w:pPr>
-        <w:pStyle w:val="a3"/>
-        <w:spacing w:before="0" w:beforeAutospacing="0" w:after="0" w:afterAutospacing="0" w:line="360" w:lineRule="auto"/>
-      </w:pPr>
-      <w:r>
-        <w:t>Ноутбук должен содержать следующую структуру:</w:t>
-      </w:r>
-    </w:p>
-    <w:p>
-      <w:pPr>
-        <w:pStyle w:val="a3"/>
-        <w:spacing w:before="0" w:beforeAutospacing="0" w:after="0" w:afterAutospacing="0" w:line="360" w:lineRule="auto"/>
-      </w:pPr>
-      <w:r>
-        <w:t>1. Титульная ячейка с ФИО, группой и номером варианта.</w:t>
-      </w:r>
-    </w:p>
-    <w:p>
-      <w:pPr>
-        <w:pStyle w:val="a3"/>
-        <w:spacing w:before="0" w:beforeAutospacing="0" w:after="0" w:afterAutospacing="0" w:line="360" w:lineRule="auto"/>
-      </w:pPr>
-      <w:r>
-        <w:t>2. Цель лабораторной работы.</w:t>
-      </w:r>
-    </w:p>
-    <w:p>
-      <w:pPr>
-        <w:pStyle w:val="a3"/>
-        <w:spacing w:before="0" w:beforeAutospacing="0" w:after="0" w:afterAutospacing="0" w:line="360" w:lineRule="auto"/>
-      </w:pPr>
-      <w:r>
-        <w:t>3. Загрузка библиотек и данных.</w:t>
-      </w:r>
-    </w:p>
-    <w:p>
-      <w:pPr>
-        <w:pStyle w:val="a3"/>
-        <w:spacing w:before="0" w:beforeAutospacing="0" w:after="0" w:afterAutospacing="0" w:line="360" w:lineRule="auto"/>
-      </w:pPr>
-      <w:r>
-        <w:t>4. Подготовка пользовательских оценок и характеристик фильмов.</w:t>
-      </w:r>
-    </w:p>
-    <w:p>
-      <w:pPr>
-        <w:pStyle w:val="a3"/>
-        <w:spacing w:before="0" w:beforeAutospacing="0" w:after="0" w:afterAutospacing="0" w:line="360" w:lineRule="auto"/>
-      </w:pPr>
-      <w:r>
-        <w:t xml:space="preserve">5. </w:t>
-      </w:r>
-      <w:proofErr w:type="spellStart"/>
-      <w:r>
-        <w:t>Content-Based</w:t>
-      </w:r>
-      <w:proofErr w:type="spellEnd"/>
+      <w:r>
+        <w:rPr>
+          <w:lang w:val="en-US"/>
+        </w:rPr>
+        <w:t>Filtering</w:t>
+      </w:r>
+      <w:r>
+        <w:t xml:space="preserve">: </w:t>
+      </w:r>
+      <w:r>
+        <w:t>рекомендации</w:t>
+      </w:r>
       <w:r>
         <w:t xml:space="preserve"> </w:t>
       </w:r>
-      <w:proofErr w:type="spellStart"/>
-      <w:r>
+      <w:r>
+        <w:t>пользователю</w:t>
+      </w:r>
+      <w:r>
+        <w:t>.</w:t>
+      </w:r>
+    </w:p>
+    <w:p>
+      <w:pPr>
+        <w:pStyle w:val="a3"/>
+        <w:spacing w:before="0" w:beforeAutospacing="0" w:after="0" w:afterAutospacing="0" w:line="360" w:lineRule="auto"/>
+        <w:rPr>
+          <w:lang w:val="en-US"/>
+        </w:rPr>
+      </w:pPr>
+      <w:r>
+        <w:rPr>
+          <w:lang w:val="en-US"/>
+        </w:rPr>
+        <w:t>7. User-Based Collaborative Filtering.</w:t>
+      </w:r>
+    </w:p>
+    <w:p>
+      <w:pPr>
+        <w:pStyle w:val="a3"/>
+        <w:spacing w:before="0" w:beforeAutospacing="0" w:after="0" w:afterAutospacing="0" w:line="360" w:lineRule="auto"/>
+        <w:rPr>
+          <w:lang w:val="en-US"/>
+        </w:rPr>
+      </w:pPr>
+      <w:r>
+        <w:rPr>
+          <w:lang w:val="en-US"/>
+        </w:rPr>
+        <w:t xml:space="preserve">8. </w:t>
+      </w:r>
+      <w:r>
+        <w:rPr>
+          <w:lang w:val="en-US"/>
+        </w:rPr>
+        <w:t>Item</w:t>
+      </w:r>
+      <w:r>
+        <w:rPr>
+          <w:lang w:val="en-US"/>
+        </w:rPr>
+        <w:t>-</w:t>
+      </w:r>
+      <w:r>
+        <w:rPr>
+          <w:lang w:val="en-US"/>
+        </w:rPr>
+        <w:t>Based</w:t>
+      </w:r>
+      <w:r>
+        <w:rPr>
+          <w:lang w:val="en-US"/>
+        </w:rPr>
+        <w:t xml:space="preserve"> </w:t>
+      </w:r>
+      <w:r>
+        <w:rPr>
+          <w:lang w:val="en-US"/>
+        </w:rPr>
+        <w:t>Collaborative</w:t>
+      </w:r>
+      <w:r>
+        <w:rPr>
+          <w:lang w:val="en-US"/>
+        </w:rPr>
+        <w:t xml:space="preserve"> </w:t>
+      </w:r>
+      <w:r>
+        <w:rPr>
+          <w:lang w:val="en-US"/>
+        </w:rPr>
         <w:t>Filtering</w:t>
       </w:r>
-      <w:proofErr w:type="spellEnd"/>
-      <w:r>
-        <w:t>: вычисление сходства фильмов.</w:t>
-      </w:r>
-    </w:p>
-    <w:p>
-      <w:pPr>
-        <w:pStyle w:val="a3"/>
-        <w:spacing w:before="0" w:beforeAutospacing="0" w:after="0" w:afterAutospacing="0" w:line="360" w:lineRule="auto"/>
+      <w:r>
         <w:rPr>
           <w:lang w:val="en-US"/>
         </w:rPr>
-      </w:pPr>
-      <w:r>
-        <w:rPr>
-          <w:lang w:val="en-US"/>
-        </w:rPr>
-        <w:lastRenderedPageBreak/>
-        <w:t xml:space="preserve">6. Content-Based Filtering: </w:t>
-      </w:r>
-      <w:r>
-        <w:t>рекомендации</w:t>
-      </w:r>
-      <w:r>
-        <w:rPr>
-          <w:lang w:val="en-US"/>
-        </w:rPr>
-        <w:t xml:space="preserve"> </w:t>
-      </w:r>
-      <w:r>
-        <w:t>пользователю</w:t>
-      </w:r>
-      <w:r>
-        <w:rPr>
-          <w:lang w:val="en-US"/>
-        </w:rPr>
         <w:t>.</w:t>
       </w:r>
     </w:p>
@@ -4206,66 +4246,6 @@
       <w:pPr>
         <w:pStyle w:val="a3"/>
         <w:spacing w:before="0" w:beforeAutospacing="0" w:after="0" w:afterAutospacing="0" w:line="360" w:lineRule="auto"/>
-        <w:rPr>
-          <w:lang w:val="en-US"/>
-        </w:rPr>
-      </w:pPr>
-      <w:r>
-        <w:rPr>
-          <w:lang w:val="en-US"/>
-        </w:rPr>
-        <w:t>7. User-Based Collaborative Filtering.</w:t>
-      </w:r>
-    </w:p>
-    <w:p>
-      <w:pPr>
-        <w:pStyle w:val="a3"/>
-        <w:spacing w:before="0" w:beforeAutospacing="0" w:after="0" w:afterAutospacing="0" w:line="360" w:lineRule="auto"/>
-      </w:pPr>
-      <w:r>
-        <w:t xml:space="preserve">8. </w:t>
-      </w:r>
-      <w:r>
-        <w:rPr>
-          <w:lang w:val="en-US"/>
-        </w:rPr>
-        <w:t>Item</w:t>
-      </w:r>
-      <w:r>
-        <w:t>-</w:t>
-      </w:r>
-      <w:r>
-        <w:rPr>
-          <w:lang w:val="en-US"/>
-        </w:rPr>
-        <w:t>Based</w:t>
-      </w:r>
-      <w:r>
-        <w:t xml:space="preserve"> </w:t>
-      </w:r>
-      <w:r>
-        <w:rPr>
-          <w:lang w:val="en-US"/>
-        </w:rPr>
-        <w:t>Collaborative</w:t>
-      </w:r>
-      <w:r>
-        <w:t xml:space="preserve"> </w:t>
-      </w:r>
-      <w:r>
-        <w:rPr>
-          <w:lang w:val="en-US"/>
-        </w:rPr>
-        <w:t>Filtering</w:t>
-      </w:r>
-      <w:r>
-        <w:t>.</w:t>
-      </w:r>
-    </w:p>
-    <w:p>
-      <w:pPr>
-        <w:pStyle w:val="a3"/>
-        <w:spacing w:before="0" w:beforeAutospacing="0" w:after="0" w:afterAutospacing="0" w:line="360" w:lineRule="auto"/>
       </w:pPr>
       <w:r>
         <w:t>9. Сравнение рекомендательных алгоритмов.</w:t>
@@ -4313,15 +4293,7 @@
         <w:spacing w:before="0" w:beforeAutospacing="0" w:after="0" w:afterAutospacing="0" w:line="360" w:lineRule="auto"/>
       </w:pPr>
       <w:r>
-        <w:t xml:space="preserve">Все ячейки должны последовательно выполняться в </w:t>
-      </w:r>
-      <w:proofErr w:type="spellStart"/>
-      <w:r>
-        <w:t>Google</w:t>
-      </w:r>
-      <w:proofErr w:type="spellEnd"/>
-      <w:r>
-        <w:t xml:space="preserve"> </w:t>
+        <w:t xml:space="preserve">Все ячейки должны последовательно выполняться в Google </w:t>
       </w:r>
       <w:proofErr w:type="spellStart"/>
       <w:r>
@@ -4396,21 +4368,7 @@
         <w:rPr>
           <w:rFonts w:ascii="Times New Roman" w:hAnsi="Times New Roman" w:cs="Times New Roman"/>
         </w:rPr>
-        <w:t xml:space="preserve">В чём заключается принцип </w:t>
-      </w:r>
-      <w:proofErr w:type="spellStart"/>
-      <w:r>
-        <w:rPr>
-          <w:rFonts w:ascii="Times New Roman" w:hAnsi="Times New Roman" w:cs="Times New Roman"/>
-        </w:rPr>
-        <w:t>Content-Based</w:t>
-      </w:r>
-      <w:proofErr w:type="spellEnd"/>
-      <w:r>
-        <w:rPr>
-          <w:rFonts w:ascii="Times New Roman" w:hAnsi="Times New Roman" w:cs="Times New Roman"/>
-        </w:rPr>
-        <w:t xml:space="preserve"> </w:t>
+        <w:t xml:space="preserve">В чём заключается принцип Content-Based </w:t>
       </w:r>
       <w:proofErr w:type="spellStart"/>
       <w:r>
@@ -4532,35 +4490,21 @@
         <w:rPr>
           <w:rFonts w:ascii="Times New Roman" w:hAnsi="Times New Roman" w:cs="Times New Roman"/>
         </w:rPr>
-        <w:t xml:space="preserve">Чем </w:t>
+        <w:t xml:space="preserve">Чем User-Based CF отличается от </w:t>
       </w:r>
       <w:proofErr w:type="spellStart"/>
       <w:r>
         <w:rPr>
           <w:rFonts w:ascii="Times New Roman" w:hAnsi="Times New Roman" w:cs="Times New Roman"/>
         </w:rPr>
-        <w:t>User-Based</w:t>
+        <w:t>Item</w:t>
       </w:r>
       <w:proofErr w:type="spellEnd"/>
       <w:r>
         <w:rPr>
           <w:rFonts w:ascii="Times New Roman" w:hAnsi="Times New Roman" w:cs="Times New Roman"/>
         </w:rPr>
-        <w:t xml:space="preserve"> CF отличается от </w:t>
-      </w:r>
-      <w:proofErr w:type="spellStart"/>
-      <w:r>
-        <w:rPr>
-          <w:rFonts w:ascii="Times New Roman" w:hAnsi="Times New Roman" w:cs="Times New Roman"/>
-        </w:rPr>
-        <w:t>Item-Based</w:t>
-      </w:r>
-      <w:proofErr w:type="spellEnd"/>
-      <w:r>
-        <w:rPr>
-          <w:rFonts w:ascii="Times New Roman" w:hAnsi="Times New Roman" w:cs="Times New Roman"/>
-        </w:rPr>
-        <w:t xml:space="preserve"> CF?</w:t>
+        <w:t>-Based CF?</w:t>
       </w:r>
     </w:p>
     <w:p>
@@ -4640,21 +4584,7 @@
         <w:rPr>
           <w:rFonts w:ascii="Times New Roman" w:hAnsi="Times New Roman" w:cs="Times New Roman"/>
         </w:rPr>
-        <w:t xml:space="preserve">Как прогнозируется пользовательская оценка в </w:t>
-      </w:r>
-      <w:proofErr w:type="spellStart"/>
-      <w:r>
-        <w:rPr>
-          <w:rFonts w:ascii="Times New Roman" w:hAnsi="Times New Roman" w:cs="Times New Roman"/>
-        </w:rPr>
-        <w:t>User-Based</w:t>
-      </w:r>
-      <w:proofErr w:type="spellEnd"/>
-      <w:r>
-        <w:rPr>
-          <w:rFonts w:ascii="Times New Roman" w:hAnsi="Times New Roman" w:cs="Times New Roman"/>
-        </w:rPr>
-        <w:t xml:space="preserve"> CF?</w:t>
+        <w:t>Как прогнозируется пользовательская оценка в User-Based CF?</w:t>
       </w:r>
     </w:p>
     <w:p>
@@ -4674,21 +4604,7 @@
         <w:rPr>
           <w:rFonts w:ascii="Times New Roman" w:hAnsi="Times New Roman" w:cs="Times New Roman"/>
         </w:rPr>
-        <w:t xml:space="preserve">Почему контентный и </w:t>
-      </w:r>
-      <w:proofErr w:type="spellStart"/>
-      <w:r>
-        <w:rPr>
-          <w:rFonts w:ascii="Times New Roman" w:hAnsi="Times New Roman" w:cs="Times New Roman"/>
-        </w:rPr>
-        <w:t>коллаборативный</w:t>
-      </w:r>
-      <w:proofErr w:type="spellEnd"/>
-      <w:r>
-        <w:rPr>
-          <w:rFonts w:ascii="Times New Roman" w:hAnsi="Times New Roman" w:cs="Times New Roman"/>
-        </w:rPr>
-        <w:t xml:space="preserve"> алгоритмы могут предлагать разные фильмы?</w:t>
+        <w:t>Почему контентный и коллаборативный алгоритмы могут предлагать разные фильмы?</w:t>
       </w:r>
     </w:p>
     <w:p>
@@ -4722,8 +4638,124 @@
 </file>
 
 <file path=word/numbering.xml><?xml version="1.0" encoding="utf-8"?>
-<w:numbering xmlns:wpc="http://schemas.microsoft.com/office/word/2010/wordprocessingCanvas" xmlns:cx="http://schemas.microsoft.com/office/drawing/2014/chartex" xmlns:mc="http://schemas.openxmlformats.org/markup-compatibility/2006" xmlns:o="urn:schemas-microsoft-com:office:office" xmlns:r="http://schemas.openxmlformats.org/officeDocument/2006/relationships" xmlns:m="http://schemas.openxmlformats.org/officeDocument/2006/math" xmlns:v="urn:schemas-microsoft-com:vml" xmlns:wp14="http://schemas.microsoft.com/office/word/2010/wordprocessingDrawing" xmlns:wp="http://schemas.openxmlformats.org/drawingml/2006/wordprocessingDrawing" xmlns:w10="urn:schemas-microsoft-com:office:word" xmlns:w="http://schemas.openxmlformats.org/wordprocessingml/2006/main" xmlns:w14="http://schemas.microsoft.com/office/word/2010/wordml" xmlns:w15="http://schemas.microsoft.com/office/word/2012/wordml" xmlns:w16se="http://schemas.microsoft.com/office/word/2015/wordml/symex" xmlns:wpg="http://schemas.microsoft.com/office/word/2010/wordprocessingGroup" xmlns:wpi="http://schemas.microsoft.com/office/word/2010/wordprocessingInk" xmlns:wne="http://schemas.microsoft.com/office/word/2006/wordml" xmlns:wps="http://schemas.microsoft.com/office/word/2010/wordprocessingShape" mc:Ignorable="w14 w15 w16se wp14">
+<w:numbering xmlns:wpc="http://schemas.microsoft.com/office/word/2010/wordprocessingCanvas" xmlns:cx="http://schemas.microsoft.com/office/drawing/2014/chartex" xmlns:cx1="http://schemas.microsoft.com/office/drawing/2015/9/8/chartex" xmlns:cx2="http://schemas.microsoft.com/office/drawing/2015/10/21/chartex" xmlns:cx3="http://schemas.microsoft.com/office/drawing/2016/5/9/chartex" xmlns:cx4="http://schemas.microsoft.com/office/drawing/2016/5/10/chartex" xmlns:cx5="http://schemas.microsoft.com/office/drawing/2016/5/11/chartex" xmlns:cx6="http://schemas.microsoft.com/office/drawing/2016/5/12/chartex" xmlns:cx7="http://schemas.microsoft.com/office/drawing/2016/5/13/chartex" xmlns:cx8="http://schemas.microsoft.com/office/drawing/2016/5/14/chartex" xmlns:mc="http://schemas.openxmlformats.org/markup-compatibility/2006" xmlns:aink="http://schemas.microsoft.com/office/drawing/2016/ink" xmlns:am3d="http://schemas.microsoft.com/office/drawing/2017/model3d" xmlns:o="urn:schemas-microsoft-com:office:office" xmlns:oel="http://schemas.microsoft.com/office/2019/extlst" xmlns:r="http://schemas.openxmlformats.org/officeDocument/2006/relationships" xmlns:m="http://schemas.openxmlformats.org/officeDocument/2006/math" xmlns:v="urn:schemas-microsoft-com:vml" xmlns:wp14="http://schemas.microsoft.com/office/word/2010/wordprocessingDrawing" xmlns:wp="http://schemas.openxmlformats.org/drawingml/2006/wordprocessingDrawing" xmlns:w10="urn:schemas-microsoft-com:office:word" xmlns:w="http://schemas.openxmlformats.org/wordprocessingml/2006/main" xmlns:w14="http://schemas.microsoft.com/office/word/2010/wordml" xmlns:w15="http://schemas.microsoft.com/office/word/2012/wordml" xmlns:w16cex="http://schemas.microsoft.com/office/word/2018/wordml/cex" xmlns:w16cid="http://schemas.microsoft.com/office/word/2016/wordml/cid" xmlns:w16="http://schemas.microsoft.com/office/word/2018/wordml" xmlns:w16du="http://schemas.microsoft.com/office/word/2023/wordml/word16du" xmlns:w16sdtdh="http://schemas.microsoft.com/office/word/2020/wordml/sdtdatahash" xmlns:w16sdtfl="http://schemas.microsoft.com/office/word/2024/wordml/sdtformatlock" xmlns:w16se="http://schemas.microsoft.com/office/word/2015/wordml/symex" xmlns:wpg="http://schemas.microsoft.com/office/word/2010/wordprocessingGroup" xmlns:wpi="http://schemas.microsoft.com/office/word/2010/wordprocessingInk" xmlns:wne="http://schemas.microsoft.com/office/word/2006/wordml" xmlns:wps="http://schemas.microsoft.com/office/word/2010/wordprocessingShape" mc:Ignorable="w14 w15 w16se w16cid w16 w16cex w16sdtdh w16sdtfl w16du wp14">
   <w:abstractNum w:abstractNumId="0" w15:restartNumberingAfterBreak="0">
+    <w:nsid w:val="0987430E"/>
+    <w:multiLevelType w:val="multilevel"/>
+    <w:tmpl w:val="08C49E84"/>
+    <w:lvl w:ilvl="0">
+      <w:start w:val="1"/>
+      <w:numFmt w:val="bullet"/>
+      <w:lvlText w:val=""/>
+      <w:lvlJc w:val="left"/>
+      <w:pPr>
+        <w:tabs>
+          <w:tab w:val="num" w:pos="720"/>
+        </w:tabs>
+        <w:ind w:left="720" w:hanging="360"/>
+      </w:pPr>
+      <w:rPr>
+        <w:rFonts w:ascii="Symbol" w:hAnsi="Symbol" w:hint="default"/>
+      </w:rPr>
+    </w:lvl>
+    <w:lvl w:ilvl="1" w:tentative="1">
+      <w:start w:val="1"/>
+      <w:numFmt w:val="decimal"/>
+      <w:lvlText w:val="%2."/>
+      <w:lvlJc w:val="left"/>
+      <w:pPr>
+        <w:tabs>
+          <w:tab w:val="num" w:pos="1440"/>
+        </w:tabs>
+        <w:ind w:left="1440" w:hanging="360"/>
+      </w:pPr>
+    </w:lvl>
+    <w:lvl w:ilvl="2" w:tentative="1">
+      <w:start w:val="1"/>
+      <w:numFmt w:val="decimal"/>
+      <w:lvlText w:val="%3."/>
+      <w:lvlJc w:val="left"/>
+      <w:pPr>
+        <w:tabs>
+          <w:tab w:val="num" w:pos="2160"/>
+        </w:tabs>
+        <w:ind w:left="2160" w:hanging="360"/>
+      </w:pPr>
+    </w:lvl>
+    <w:lvl w:ilvl="3" w:tentative="1">
+      <w:start w:val="1"/>
+      <w:numFmt w:val="decimal"/>
+      <w:lvlText w:val="%4."/>
+      <w:lvlJc w:val="left"/>
+      <w:pPr>
+        <w:tabs>
+          <w:tab w:val="num" w:pos="2880"/>
+        </w:tabs>
+        <w:ind w:left="2880" w:hanging="360"/>
+      </w:pPr>
+    </w:lvl>
+    <w:lvl w:ilvl="4" w:tentative="1">
+      <w:start w:val="1"/>
+      <w:numFmt w:val="decimal"/>
+      <w:lvlText w:val="%5."/>
+      <w:lvlJc w:val="left"/>
+      <w:pPr>
+        <w:tabs>
+          <w:tab w:val="num" w:pos="3600"/>
+        </w:tabs>
+        <w:ind w:left="3600" w:hanging="360"/>
+      </w:pPr>
+    </w:lvl>
+    <w:lvl w:ilvl="5" w:tentative="1">
+      <w:start w:val="1"/>
+      <w:numFmt w:val="decimal"/>
+      <w:lvlText w:val="%6."/>
+      <w:lvlJc w:val="left"/>
+      <w:pPr>
+        <w:tabs>
+          <w:tab w:val="num" w:pos="4320"/>
+        </w:tabs>
+        <w:ind w:left="4320" w:hanging="360"/>
+      </w:pPr>
+    </w:lvl>
+    <w:lvl w:ilvl="6" w:tentative="1">
+      <w:start w:val="1"/>
+      <w:numFmt w:val="decimal"/>
+      <w:lvlText w:val="%7."/>
+      <w:lvlJc w:val="left"/>
+      <w:pPr>
+        <w:tabs>
+          <w:tab w:val="num" w:pos="5040"/>
+        </w:tabs>
+        <w:ind w:left="5040" w:hanging="360"/>
+      </w:pPr>
+    </w:lvl>
+    <w:lvl w:ilvl="7" w:tentative="1">
+      <w:start w:val="1"/>
+      <w:numFmt w:val="decimal"/>
+      <w:lvlText w:val="%8."/>
+      <w:lvlJc w:val="left"/>
+      <w:pPr>
+        <w:tabs>
+          <w:tab w:val="num" w:pos="5760"/>
+        </w:tabs>
+        <w:ind w:left="5760" w:hanging="360"/>
+      </w:pPr>
+    </w:lvl>
+    <w:lvl w:ilvl="8" w:tentative="1">
+      <w:start w:val="1"/>
+      <w:numFmt w:val="decimal"/>
+      <w:lvlText w:val="%9."/>
+      <w:lvlJc w:val="left"/>
+      <w:pPr>
+        <w:tabs>
+          <w:tab w:val="num" w:pos="6480"/>
+        </w:tabs>
+        <w:ind w:left="6480" w:hanging="360"/>
+      </w:pPr>
+    </w:lvl>
+  </w:abstractNum>
+  <w:abstractNum w:abstractNumId="1" w15:restartNumberingAfterBreak="0">
     <w:nsid w:val="0A657574"/>
     <w:multiLevelType w:val="multilevel"/>
     <w:tmpl w:val="4D6C9E3A"/>
@@ -4872,7 +4904,7 @@
       </w:rPr>
     </w:lvl>
   </w:abstractNum>
-  <w:abstractNum w:abstractNumId="1" w15:restartNumberingAfterBreak="0">
+  <w:abstractNum w:abstractNumId="2" w15:restartNumberingAfterBreak="0">
     <w:nsid w:val="2CD36841"/>
     <w:multiLevelType w:val="hybridMultilevel"/>
     <w:tmpl w:val="B9464CF6"/>
@@ -4985,7 +5017,7 @@
       </w:rPr>
     </w:lvl>
   </w:abstractNum>
-  <w:abstractNum w:abstractNumId="2" w15:restartNumberingAfterBreak="0">
+  <w:abstractNum w:abstractNumId="3" w15:restartNumberingAfterBreak="0">
     <w:nsid w:val="340D05CC"/>
     <w:multiLevelType w:val="multilevel"/>
     <w:tmpl w:val="0268C140"/>
@@ -5134,7 +5166,7 @@
       </w:rPr>
     </w:lvl>
   </w:abstractNum>
-  <w:abstractNum w:abstractNumId="3" w15:restartNumberingAfterBreak="0">
+  <w:abstractNum w:abstractNumId="4" w15:restartNumberingAfterBreak="0">
     <w:nsid w:val="50551572"/>
     <w:multiLevelType w:val="multilevel"/>
     <w:tmpl w:val="FB2EDFCC"/>
@@ -5283,7 +5315,7 @@
       </w:rPr>
     </w:lvl>
   </w:abstractNum>
-  <w:abstractNum w:abstractNumId="4" w15:restartNumberingAfterBreak="0">
+  <w:abstractNum w:abstractNumId="5" w15:restartNumberingAfterBreak="0">
     <w:nsid w:val="50BA3985"/>
     <w:multiLevelType w:val="multilevel"/>
     <w:tmpl w:val="A6B86A10"/>
@@ -5396,7 +5428,7 @@
       </w:pPr>
     </w:lvl>
   </w:abstractNum>
-  <w:abstractNum w:abstractNumId="5" w15:restartNumberingAfterBreak="0">
+  <w:abstractNum w:abstractNumId="6" w15:restartNumberingAfterBreak="0">
     <w:nsid w:val="542E2FD5"/>
     <w:multiLevelType w:val="hybridMultilevel"/>
     <w:tmpl w:val="5B94C0EE"/>
@@ -5509,7 +5541,7 @@
       </w:rPr>
     </w:lvl>
   </w:abstractNum>
-  <w:abstractNum w:abstractNumId="6" w15:restartNumberingAfterBreak="0">
+  <w:abstractNum w:abstractNumId="7" w15:restartNumberingAfterBreak="0">
     <w:nsid w:val="5B1C0C82"/>
     <w:multiLevelType w:val="multilevel"/>
     <w:tmpl w:val="125CA0DE"/>
@@ -5622,7 +5654,7 @@
       </w:pPr>
     </w:lvl>
   </w:abstractNum>
-  <w:abstractNum w:abstractNumId="7" w15:restartNumberingAfterBreak="0">
+  <w:abstractNum w:abstractNumId="8" w15:restartNumberingAfterBreak="0">
     <w:nsid w:val="5D1D5AED"/>
     <w:multiLevelType w:val="multilevel"/>
     <w:tmpl w:val="01C09510"/>
@@ -5735,7 +5767,7 @@
       </w:pPr>
     </w:lvl>
   </w:abstractNum>
-  <w:abstractNum w:abstractNumId="8" w15:restartNumberingAfterBreak="0">
+  <w:abstractNum w:abstractNumId="9" w15:restartNumberingAfterBreak="0">
     <w:nsid w:val="5E193706"/>
     <w:multiLevelType w:val="hybridMultilevel"/>
     <w:tmpl w:val="4DC86B72"/>
@@ -5848,7 +5880,7 @@
       </w:rPr>
     </w:lvl>
   </w:abstractNum>
-  <w:abstractNum w:abstractNumId="9" w15:restartNumberingAfterBreak="0">
+  <w:abstractNum w:abstractNumId="10" w15:restartNumberingAfterBreak="0">
     <w:nsid w:val="5E7C020F"/>
     <w:multiLevelType w:val="multilevel"/>
     <w:tmpl w:val="557839EA"/>
@@ -5997,7 +6029,7 @@
       </w:rPr>
     </w:lvl>
   </w:abstractNum>
-  <w:abstractNum w:abstractNumId="10" w15:restartNumberingAfterBreak="0">
+  <w:abstractNum w:abstractNumId="11" w15:restartNumberingAfterBreak="0">
     <w:nsid w:val="600F6DA2"/>
     <w:multiLevelType w:val="multilevel"/>
     <w:tmpl w:val="6DB2DC96"/>
@@ -6110,7 +6142,7 @@
       </w:pPr>
     </w:lvl>
   </w:abstractNum>
-  <w:abstractNum w:abstractNumId="11" w15:restartNumberingAfterBreak="0">
+  <w:abstractNum w:abstractNumId="12" w15:restartNumberingAfterBreak="0">
     <w:nsid w:val="66C1552E"/>
     <w:multiLevelType w:val="multilevel"/>
     <w:tmpl w:val="0D1C71EA"/>
@@ -6223,7 +6255,7 @@
       </w:pPr>
     </w:lvl>
   </w:abstractNum>
-  <w:abstractNum w:abstractNumId="12" w15:restartNumberingAfterBreak="0">
+  <w:abstractNum w:abstractNumId="13" w15:restartNumberingAfterBreak="0">
     <w:nsid w:val="6E5B61A4"/>
     <w:multiLevelType w:val="multilevel"/>
     <w:tmpl w:val="12ACD65E"/>
@@ -6336,7 +6368,7 @@
       </w:pPr>
     </w:lvl>
   </w:abstractNum>
-  <w:abstractNum w:abstractNumId="13" w15:restartNumberingAfterBreak="0">
+  <w:abstractNum w:abstractNumId="14" w15:restartNumberingAfterBreak="0">
     <w:nsid w:val="7B776AA0"/>
     <w:multiLevelType w:val="multilevel"/>
     <w:tmpl w:val="89807B4E"/>
@@ -6485,53 +6517,56 @@
       </w:rPr>
     </w:lvl>
   </w:abstractNum>
-  <w:num w:numId="1">
+  <w:num w:numId="1" w16cid:durableId="1329095668">
+    <w:abstractNumId w:val="7"/>
+  </w:num>
+  <w:num w:numId="2" w16cid:durableId="152914123">
+    <w:abstractNumId w:val="1"/>
+  </w:num>
+  <w:num w:numId="3" w16cid:durableId="1435899145">
+    <w:abstractNumId w:val="3"/>
+  </w:num>
+  <w:num w:numId="4" w16cid:durableId="1560901324">
+    <w:abstractNumId w:val="8"/>
+  </w:num>
+  <w:num w:numId="5" w16cid:durableId="1051611975">
+    <w:abstractNumId w:val="14"/>
+  </w:num>
+  <w:num w:numId="6" w16cid:durableId="1294676731">
+    <w:abstractNumId w:val="13"/>
+  </w:num>
+  <w:num w:numId="7" w16cid:durableId="1498492958">
+    <w:abstractNumId w:val="10"/>
+  </w:num>
+  <w:num w:numId="8" w16cid:durableId="93013313">
+    <w:abstractNumId w:val="4"/>
+  </w:num>
+  <w:num w:numId="9" w16cid:durableId="1033073986">
+    <w:abstractNumId w:val="11"/>
+  </w:num>
+  <w:num w:numId="10" w16cid:durableId="207186825">
     <w:abstractNumId w:val="6"/>
   </w:num>
-  <w:num w:numId="2">
-    <w:abstractNumId w:val="0"/>
-  </w:num>
-  <w:num w:numId="3">
+  <w:num w:numId="11" w16cid:durableId="445662214">
     <w:abstractNumId w:val="2"/>
   </w:num>
-  <w:num w:numId="4">
-    <w:abstractNumId w:val="7"/>
+  <w:num w:numId="12" w16cid:durableId="458845106">
+    <w:abstractNumId w:val="9"/>
   </w:num>
-  <w:num w:numId="5">
-    <w:abstractNumId w:val="13"/>
+  <w:num w:numId="13" w16cid:durableId="1532185962">
+    <w:abstractNumId w:val="5"/>
   </w:num>
-  <w:num w:numId="6">
+  <w:num w:numId="14" w16cid:durableId="1501695494">
     <w:abstractNumId w:val="12"/>
   </w:num>
-  <w:num w:numId="7">
-    <w:abstractNumId w:val="9"/>
-  </w:num>
-  <w:num w:numId="8">
-    <w:abstractNumId w:val="3"/>
-  </w:num>
-  <w:num w:numId="9">
-    <w:abstractNumId w:val="10"/>
-  </w:num>
-  <w:num w:numId="10">
-    <w:abstractNumId w:val="5"/>
-  </w:num>
-  <w:num w:numId="11">
-    <w:abstractNumId w:val="1"/>
-  </w:num>
-  <w:num w:numId="12">
-    <w:abstractNumId w:val="8"/>
-  </w:num>
-  <w:num w:numId="13">
-    <w:abstractNumId w:val="4"/>
-  </w:num>
-  <w:num w:numId="14">
-    <w:abstractNumId w:val="11"/>
+  <w:num w:numId="15" w16cid:durableId="531574743">
+    <w:abstractNumId w:val="0"/>
   </w:num>
 </w:numbering>
 </file>
 
 <file path=word/styles.xml><?xml version="1.0" encoding="utf-8"?>
-<w:styles xmlns:mc="http://schemas.openxmlformats.org/markup-compatibility/2006" xmlns:r="http://schemas.openxmlformats.org/officeDocument/2006/relationships" xmlns:w="http://schemas.openxmlformats.org/wordprocessingml/2006/main" xmlns:w14="http://schemas.microsoft.com/office/word/2010/wordml" xmlns:w15="http://schemas.microsoft.com/office/word/2012/wordml" xmlns:w16se="http://schemas.microsoft.com/office/word/2015/wordml/symex" mc:Ignorable="w14 w15 w16se">
+<w:styles xmlns:mc="http://schemas.openxmlformats.org/markup-compatibility/2006" xmlns:r="http://schemas.openxmlformats.org/officeDocument/2006/relationships" xmlns:w="http://schemas.openxmlformats.org/wordprocessingml/2006/main" xmlns:w14="http://schemas.microsoft.com/office/word/2010/wordml" xmlns:w15="http://schemas.microsoft.com/office/word/2012/wordml" xmlns:w16cex="http://schemas.microsoft.com/office/word/2018/wordml/cex" xmlns:w16cid="http://schemas.microsoft.com/office/word/2016/wordml/cid" xmlns:w16="http://schemas.microsoft.com/office/word/2018/wordml" xmlns:w16du="http://schemas.microsoft.com/office/word/2023/wordml/word16du" xmlns:w16sdtdh="http://schemas.microsoft.com/office/word/2020/wordml/sdtdatahash" xmlns:w16sdtfl="http://schemas.microsoft.com/office/word/2024/wordml/sdtformatlock" xmlns:w16se="http://schemas.microsoft.com/office/word/2015/wordml/symex" mc:Ignorable="w14 w15 w16se w16cid w16 w16cex w16sdtdh w16sdtfl w16du">
   <w:docDefaults>
     <w:rPrDefault>
       <w:rPr>
@@ -6547,7 +6582,7 @@
       </w:pPr>
     </w:pPrDefault>
   </w:docDefaults>
-  <w:latentStyles w:defLockedState="0" w:defUIPriority="99" w:defSemiHidden="0" w:defUnhideWhenUsed="0" w:defQFormat="0" w:count="371">
+  <w:latentStyles w:defLockedState="0" w:defUIPriority="99" w:defSemiHidden="0" w:defUnhideWhenUsed="0" w:defQFormat="0" w:count="376">
     <w:lsdException w:name="Normal" w:uiPriority="0" w:qFormat="1"/>
     <w:lsdException w:name="heading 1" w:uiPriority="9" w:qFormat="1"/>
     <w:lsdException w:name="heading 2" w:semiHidden="1" w:uiPriority="9" w:unhideWhenUsed="1" w:qFormat="1"/>
@@ -6919,6 +6954,11 @@
     <w:lsdException w:name="List Table 5 Dark Accent 6" w:uiPriority="50"/>
     <w:lsdException w:name="List Table 6 Colorful Accent 6" w:uiPriority="51"/>
     <w:lsdException w:name="List Table 7 Colorful Accent 6" w:uiPriority="52"/>
+    <w:lsdException w:name="Mention" w:semiHidden="1" w:unhideWhenUsed="1"/>
+    <w:lsdException w:name="Smart Hyperlink" w:semiHidden="1" w:unhideWhenUsed="1"/>
+    <w:lsdException w:name="Hashtag" w:semiHidden="1" w:unhideWhenUsed="1"/>
+    <w:lsdException w:name="Unresolved Mention" w:semiHidden="1" w:unhideWhenUsed="1"/>
+    <w:lsdException w:name="Smart Link" w:semiHidden="1" w:unhideWhenUsed="1"/>
   </w:latentStyles>
   <w:style w:type="paragraph" w:default="1" w:styleId="a">
     <w:name w:val="Normal"/>

</xml_diff>